<commit_message>
Correção na cláusula 6.12
</commit_message>
<xml_diff>
--- a/template/template_avista_es.docx
+++ b/template/template_avista_es.docx
@@ -785,7 +785,6 @@
           <w:b/>
           <w:bCs/>
           <w:color w:val="000000" w:themeColor="text1"/>
-          <w:highlight w:val="yellow"/>
         </w:rPr>
       </w:pPr>
       <w:r>
@@ -794,7 +793,6 @@
           <w:b/>
           <w:bCs/>
           <w:color w:val="000000" w:themeColor="text1"/>
-          <w:highlight w:val="yellow"/>
         </w:rPr>
         <w:t xml:space="preserve">Das 18:00 às 22:00 (Dia </w:t>
       </w:r>
@@ -804,7 +802,6 @@
           <w:b/>
           <w:bCs/>
           <w:color w:val="000000" w:themeColor="text1"/>
-          <w:highlight w:val="yellow"/>
         </w:rPr>
         <w:t>05</w:t>
       </w:r>
@@ -814,7 +811,6 @@
           <w:b/>
           <w:bCs/>
           <w:color w:val="000000" w:themeColor="text1"/>
-          <w:highlight w:val="yellow"/>
         </w:rPr>
         <w:t xml:space="preserve"> – Terça - feira)</w:t>
       </w:r>
@@ -828,7 +824,6 @@
           <w:b/>
           <w:bCs/>
           <w:color w:val="000000" w:themeColor="text1"/>
-          <w:highlight w:val="yellow"/>
         </w:rPr>
       </w:pPr>
       <w:r>
@@ -837,7 +832,6 @@
           <w:b/>
           <w:bCs/>
           <w:color w:val="000000" w:themeColor="text1"/>
-          <w:highlight w:val="yellow"/>
         </w:rPr>
         <w:t xml:space="preserve">Das 10:00 às 22:00 (Do dia </w:t>
       </w:r>
@@ -847,7 +841,6 @@
           <w:b/>
           <w:bCs/>
           <w:color w:val="000000" w:themeColor="text1"/>
-          <w:highlight w:val="yellow"/>
         </w:rPr>
         <w:t>06</w:t>
       </w:r>
@@ -857,7 +850,6 @@
           <w:b/>
           <w:bCs/>
           <w:color w:val="000000" w:themeColor="text1"/>
-          <w:highlight w:val="yellow"/>
         </w:rPr>
         <w:t xml:space="preserve"> ao </w:t>
       </w:r>
@@ -867,7 +859,6 @@
           <w:b/>
           <w:bCs/>
           <w:color w:val="000000" w:themeColor="text1"/>
-          <w:highlight w:val="yellow"/>
         </w:rPr>
         <w:t>09</w:t>
       </w:r>
@@ -877,7 +868,6 @@
           <w:b/>
           <w:bCs/>
           <w:color w:val="000000" w:themeColor="text1"/>
-          <w:highlight w:val="yellow"/>
         </w:rPr>
         <w:t xml:space="preserve"> quarta a sábado)</w:t>
       </w:r>
@@ -897,7 +887,6 @@
           <w:b/>
           <w:bCs/>
           <w:color w:val="000000" w:themeColor="text1"/>
-          <w:highlight w:val="yellow"/>
         </w:rPr>
         <w:t xml:space="preserve">Das 10:00 às 20:00 (Dia </w:t>
       </w:r>
@@ -907,7 +896,6 @@
           <w:b/>
           <w:bCs/>
           <w:color w:val="000000" w:themeColor="text1"/>
-          <w:highlight w:val="yellow"/>
         </w:rPr>
         <w:t>10</w:t>
       </w:r>
@@ -917,7 +905,6 @@
           <w:b/>
           <w:bCs/>
           <w:color w:val="000000" w:themeColor="text1"/>
-          <w:highlight w:val="yellow"/>
         </w:rPr>
         <w:t xml:space="preserve"> no domingo)</w:t>
       </w:r>
@@ -1739,7 +1726,6 @@
       <w:r>
         <w:rPr>
           <w:rFonts w:ascii="Arial" w:hAnsi="Arial" w:cs="Arial"/>
-          <w:highlight w:val="yellow"/>
         </w:rPr>
         <w:t xml:space="preserve">dia </w:t>
       </w:r>
@@ -1747,7 +1733,6 @@
         <w:rPr>
           <w:rFonts w:ascii="Arial" w:hAnsi="Arial" w:cs="Arial"/>
           <w:b/>
-          <w:highlight w:val="yellow"/>
         </w:rPr>
         <w:t>0</w:t>
       </w:r>
@@ -1755,7 +1740,6 @@
         <w:rPr>
           <w:rFonts w:ascii="Arial" w:hAnsi="Arial" w:cs="Arial"/>
           <w:b/>
-          <w:highlight w:val="yellow"/>
         </w:rPr>
         <w:t>3</w:t>
       </w:r>
@@ -1763,7 +1747,6 @@
         <w:rPr>
           <w:rFonts w:ascii="Arial" w:hAnsi="Arial" w:cs="Arial"/>
           <w:b/>
-          <w:highlight w:val="yellow"/>
         </w:rPr>
         <w:t>/05/2026</w:t>
       </w:r>
@@ -1819,43 +1802,12 @@
         <w:rPr>
           <w:rFonts w:ascii="Arial" w:hAnsi="Arial" w:cs="Arial"/>
         </w:rPr>
-        <w:t>2.9</w:t>
-      </w:r>
-      <w:r>
-        <w:rPr>
-          <w:rFonts w:ascii="Arial" w:hAnsi="Arial" w:cs="Arial"/>
-        </w:rPr>
-        <w:t xml:space="preserve">. É expressamente vedada a desmontagem do estande antes do encerramento oficial do evento ou a permanência no local após o horário limite de </w:t>
-      </w:r>
-      <w:r>
-        <w:rPr>
-          <w:rFonts w:ascii="Arial" w:hAnsi="Arial" w:cs="Arial"/>
-        </w:rPr>
-        <w:t>20</w:t>
-      </w:r>
-      <w:r>
-        <w:rPr>
-          <w:rFonts w:ascii="Arial" w:hAnsi="Arial" w:cs="Arial"/>
-        </w:rPr>
-        <w:t>h00 (</w:t>
-      </w:r>
-      <w:r>
-        <w:rPr>
-          <w:rFonts w:ascii="Arial" w:hAnsi="Arial" w:cs="Arial"/>
-        </w:rPr>
-        <w:t>vinte horas</w:t>
-      </w:r>
-      <w:r>
-        <w:rPr>
-          <w:rFonts w:ascii="Arial" w:hAnsi="Arial" w:cs="Arial"/>
-        </w:rPr>
-        <w:t xml:space="preserve">) do dia </w:t>
-      </w:r>
-      <w:r>
-        <w:rPr>
-          <w:rFonts w:ascii="Arial" w:hAnsi="Arial" w:cs="Arial"/>
-          <w:b/>
-          <w:highlight w:val="yellow"/>
+        <w:t xml:space="preserve">2.9. É expressamente vedada a desmontagem do estande antes do encerramento oficial do evento ou a permanência no local após o horário limite de 20h00 (vinte horas) do dia </w:t>
+      </w:r>
+      <w:r>
+        <w:rPr>
+          <w:rFonts w:ascii="Arial" w:hAnsi="Arial" w:cs="Arial"/>
+          <w:b/>
         </w:rPr>
         <w:t>10/05/2026</w:t>
       </w:r>
@@ -1863,31 +1815,13 @@
         <w:rPr>
           <w:rFonts w:ascii="Arial" w:hAnsi="Arial" w:cs="Arial"/>
         </w:rPr>
-        <w:t xml:space="preserve">. O descumprimento desta regra sujeitará o EXPOSITOR à aplicação de multa não compensatória equivalente a </w:t>
-      </w:r>
-      <w:r>
-        <w:rPr>
-          <w:rFonts w:ascii="Arial" w:hAnsi="Arial" w:cs="Arial"/>
-        </w:rPr>
-        <w:t>30% (trinta por cento</w:t>
-      </w:r>
-      <w:r>
-        <w:rPr>
-          <w:rFonts w:ascii="Arial" w:hAnsi="Arial" w:cs="Arial"/>
-        </w:rPr>
-        <w:t>)</w:t>
-      </w:r>
-      <w:r>
-        <w:rPr>
-          <w:rFonts w:ascii="Arial" w:hAnsi="Arial" w:cs="Arial"/>
-        </w:rPr>
-        <w:t xml:space="preserve"> </w:t>
-      </w:r>
-      <w:r>
-        <w:rPr>
-          <w:rFonts w:ascii="Arial" w:hAnsi="Arial" w:cs="Arial"/>
-        </w:rPr>
-        <w:t>do valor total pago pelo espaço, a ser cobrada por meio de boleto bancário emitido pelo ORGANIZADOR. Além disso, o EXPOSITOR infrator poderá ser impedido de participar de futuras edições do evento, a exclusivo critério do ORGANIZADOR.</w:t>
+        <w:t>. O descumprimento desta regra sujeitará o EXPOSITOR à aplicação de multa não compensatória equivalente a 30% (trinta por cento) do valor total pago pelo espaço, a ser cobrada por meio de boleto bancário emitido pelo ORGANIZADOR. Além disso, o EXPOSITOR</w:t>
+      </w:r>
+      <w:r>
+        <w:rPr>
+          <w:rFonts w:ascii="Arial" w:hAnsi="Arial" w:cs="Arial"/>
+        </w:rPr>
+        <w:t xml:space="preserve"> infrator poderá ser impedido de participar de futuras edições do evento, a exclusivo critério do ORGANIZADOR.</w:t>
       </w:r>
     </w:p>
     <w:p>
@@ -4615,13 +4549,18 @@
         <w:rPr>
           <w:rFonts w:ascii="Arial" w:hAnsi="Arial" w:cs="Arial"/>
         </w:rPr>
-        <w:t xml:space="preserve">É expressamente vedada ao EXPOSITOR a instalação de artefatos elétricos, fiações, equipamentos ou quaisquer dispositivos que possam representar risco à segurança operacional do evento e dos demais participantes, quando não estiverem em conformidade com as normas técnicas previstas no Manual de Operações, especialmente no capítulo referente à Energia Elétrica. O EXPOSITOR possui, por contrato, o direito a apenas 01 (um) KVA de carga elétrica inclusa, sendo obrigatória a solicitação formal, por meio do sistema SIGEVENT, para qualquer demanda adicional, até a data limite de </w:t>
-      </w:r>
-      <w:r>
-        <w:rPr>
-          <w:rFonts w:ascii="Arial" w:hAnsi="Arial" w:cs="Arial"/>
-          <w:b/>
-          <w:highlight w:val="yellow"/>
+        <w:t xml:space="preserve">É expressamente vedada ao EXPOSITOR a instalação de artefatos elétricos, fiações, equipamentos ou quaisquer dispositivos que possam representar risco à segurança operacional do evento e dos demais participantes, quando não estiverem em conformidade com as normas técnicas previstas no Manual de Operações, especialmente no capítulo referente à Energia Elétrica. O EXPOSITOR possui, por contrato, o direito a apenas 01 (um) KVA de carga elétrica inclusa, sendo obrigatória a solicitação formal, por meio do sistema SIGEVENT, para qualquer demanda adicional, até a data limite </w:t>
+      </w:r>
+      <w:r>
+        <w:rPr>
+          <w:rFonts w:ascii="Arial" w:hAnsi="Arial" w:cs="Arial"/>
+        </w:rPr>
+        <w:t xml:space="preserve">de </w:t>
+      </w:r>
+      <w:r>
+        <w:rPr>
+          <w:rFonts w:ascii="Arial" w:hAnsi="Arial" w:cs="Arial"/>
+          <w:b/>
         </w:rPr>
         <w:t>28</w:t>
       </w:r>
@@ -4629,7 +4568,6 @@
         <w:rPr>
           <w:rFonts w:ascii="Arial" w:hAnsi="Arial" w:cs="Arial"/>
           <w:b/>
-          <w:highlight w:val="yellow"/>
         </w:rPr>
         <w:t>/0</w:t>
       </w:r>
@@ -4637,7 +4575,6 @@
         <w:rPr>
           <w:rFonts w:ascii="Arial" w:hAnsi="Arial" w:cs="Arial"/>
           <w:b/>
-          <w:highlight w:val="yellow"/>
         </w:rPr>
         <w:t>4</w:t>
       </w:r>
@@ -4645,7 +4582,6 @@
         <w:rPr>
           <w:rFonts w:ascii="Arial" w:hAnsi="Arial" w:cs="Arial"/>
           <w:b/>
-          <w:highlight w:val="yellow"/>
         </w:rPr>
         <w:t>/2026</w:t>
       </w:r>
@@ -4677,7 +4613,13 @@
         <w:rPr>
           <w:rFonts w:ascii="Arial" w:hAnsi="Arial" w:cs="Arial"/>
         </w:rPr>
-        <w:t>5.5. É PROIBIDO fumar no interior e área comum interna do local do evento;</w:t>
+        <w:t>5.5. É PROIBIDO fumar no interior e</w:t>
+      </w:r>
+      <w:r>
+        <w:rPr>
+          <w:rFonts w:ascii="Arial" w:hAnsi="Arial" w:cs="Arial"/>
+        </w:rPr>
+        <w:t xml:space="preserve"> área comum interna do local do evento;</w:t>
       </w:r>
     </w:p>
     <w:p>
@@ -5010,20 +4952,19 @@
         <w:rPr>
           <w:rFonts w:ascii="Arial" w:hAnsi="Arial" w:cs="Arial"/>
         </w:rPr>
-        <w:t xml:space="preserve">É PROIBIDA a realização de quaisquer ações promocionais no evento sem aprovação prévia e expressa do ORGANIZADOR. Para esse tipo de solicitação, existe uma seção específica no Manual de Operações que deve ser consultada previamente e as propostas devem ser encaminhadas diretamente para análise e autorização por meio do e-mail: </w:t>
-      </w:r>
-      <w:r>
-        <w:rPr>
-          <w:rFonts w:ascii="Arial" w:hAnsi="Arial" w:cs="Arial"/>
-          <w:highlight w:val="yellow"/>
-        </w:rPr>
-        <w:t>encantamento01@alfaiatariadeideias.com.br ou pelo WhatsApp: (27) 99802-3814</w:t>
-      </w:r>
-      <w:r>
-        <w:rPr>
-          <w:rFonts w:ascii="Arial" w:hAnsi="Arial" w:cs="Arial"/>
-        </w:rPr>
-        <w:t>. O descumprimento desta regra poderá acarretar a suspensão imediata da ação e aplicação das penalidades cabíveis.</w:t>
+        <w:t xml:space="preserve">É PROIBIDA a realização de quaisquer ações promocionais no evento sem aprovação prévia e expressa do ORGANIZADOR. Para esse tipo de solicitação, existe uma </w:t>
+      </w:r>
+      <w:r>
+        <w:rPr>
+          <w:rFonts w:ascii="Arial" w:hAnsi="Arial" w:cs="Arial"/>
+        </w:rPr>
+        <w:t>seção específica no Manual de Operações que deve ser consultada previamente e as propostas devem ser encaminhadas diretamente para análise e autorização por meio do e-mail: encantamento01@alfaiatariadeideias.com.br ou pelo WhatsApp: (27) 99802-3814. O descumprimento desta regra poderá acarretar a suspensão imediata da ação e aplicação das penalidades</w:t>
+      </w:r>
+      <w:r>
+        <w:rPr>
+          <w:rFonts w:ascii="Arial" w:hAnsi="Arial" w:cs="Arial"/>
+        </w:rPr>
+        <w:t xml:space="preserve"> cabíveis.</w:t>
       </w:r>
     </w:p>
     <w:p>
@@ -6141,42 +6082,6 @@
         <w:rPr>
           <w:rFonts w:ascii="Arial" w:hAnsi="Arial" w:cs="Arial"/>
         </w:rPr>
-        <w:t xml:space="preserve">6.12. Para fins de referência, a taxa de energia elétrica será cobrada no valor de R$ </w:t>
-      </w:r>
-      <w:r>
-        <w:rPr>
-          <w:rFonts w:ascii="Arial" w:hAnsi="Arial" w:cs="Arial"/>
-        </w:rPr>
-        <w:t>4</w:t>
-      </w:r>
-      <w:r>
-        <w:rPr>
-          <w:rFonts w:ascii="Arial" w:hAnsi="Arial" w:cs="Arial"/>
-        </w:rPr>
-        <w:t>00,00 (seiscentos reais) por KVA adicional contratado. A Taxa de Fiscalização de Estabelecimento (TFE) será no valor fixo de R$ 200,00 (duzentos reais), ambos com vencimento na assinatura do contrato, salvo disposição contrária em documento anexo.</w:t>
-      </w:r>
-    </w:p>
-    <w:p>
-      <w:pPr>
-        <w:spacing w:after="0" w:line="240" w:lineRule="auto"/>
-        <w:jc w:val="both"/>
-        <w:rPr>
-          <w:rFonts w:ascii="Arial" w:hAnsi="Arial" w:cs="Arial"/>
-        </w:rPr>
-      </w:pPr>
-    </w:p>
-    <w:p>
-      <w:pPr>
-        <w:spacing w:after="0" w:line="240" w:lineRule="auto"/>
-        <w:jc w:val="both"/>
-        <w:rPr>
-          <w:rFonts w:ascii="Arial" w:hAnsi="Arial" w:cs="Arial"/>
-        </w:rPr>
-      </w:pPr>
-      <w:r>
-        <w:rPr>
-          <w:rFonts w:ascii="Arial" w:hAnsi="Arial" w:cs="Arial"/>
-        </w:rPr>
         <w:t>6.13. Caso o EXPOSITOR contrate fornecedores externos para montagem, decoração, logística ou qualquer outro serviço, deverá observar integralmente o Manual de Operações e o regulamento técnico vigente, responsabilizando-se pela obtenção de autorizações, recolhimento de ART/RRT, taxas e demais encargos aplicáveis. O descumprimento poderá implicar em multa, impedimento de acesso ao pavilhão ou outras penalidades previstas contratualmente.</w:t>
       </w:r>
     </w:p>
@@ -6307,15 +6212,7 @@
           <w:rFonts w:ascii="Arial" w:hAnsi="Arial" w:cs="Arial"/>
           <w:color w:val="000000" w:themeColor="text1"/>
         </w:rPr>
-        <w:t xml:space="preserve">7.2. Para fins desta cláusula efeito material adverso significa (i) qualquer fato, evento, mudança, ocorrência, condição, circunstância ou efeito ocorrido durante o evento, mesmo com efeitos após esta data que, individualmente ou em conjunto com outros fatos, eventos, mudanças, ocorrências, condições, circunstâncias ou efeitos (a) cause qualquer impacto negativo relevante para o </w:t>
-      </w:r>
-      <w:r>
-        <w:rPr>
-          <w:rFonts w:ascii="Arial" w:hAnsi="Arial" w:cs="Arial"/>
-          <w:color w:val="000000" w:themeColor="text1"/>
-        </w:rPr>
-        <w:lastRenderedPageBreak/>
-        <w:t>Negócio e/ou situações que possam colocar em risco a reputação da ALFAIATARIA, independentemente do impacto financeiro no negócio.  </w:t>
+        <w:t>7.2. Para fins desta cláusula efeito material adverso significa (i) qualquer fato, evento, mudança, ocorrência, condição, circunstância ou efeito ocorrido durante o evento, mesmo com efeitos após esta data que, individualmente ou em conjunto com outros fatos, eventos, mudanças, ocorrências, condições, circunstâncias ou efeitos (a) cause qualquer impacto negativo relevante para o Negócio e/ou situações que possam colocar em risco a reputação da ALFAIATARIA, independentemente do impacto financeiro no negócio.  </w:t>
       </w:r>
     </w:p>
     <w:p>
@@ -6368,14 +6265,9 @@
           <w:szCs w:val="24"/>
           <w:lang w:val="pt-BR"/>
         </w:rPr>
-        <w:t xml:space="preserve"> em decorrência do evento e da empresa parceira, qualquer ação judicial intentada, mesmo que pendente de julgamento, todas as obrigações, responsabilidades, contingências, perdas, danos diretos e indiretos, lucros cessantes, prejuízos, responsabilidade pecuniária ou conversível em pecúnia, custos e despesas com ações, processos, arbitragens ou procedimentos (incluindo valores pagos por avaliações, laudos, sentenças ou acordos, juros, multas, correção monetária, despesas de desembolso e honorários de advogados, contadores, peritos e outros especialistas, procedimentos,  honorários de sucumbência, custas judiciais, quaisquer outros custos e despesas direta ou indiretamente relacionados a uma Perda, bem como toda e qualquer multa, juros, indenização e/ou penalidade), depósitos judiciais e outros custos e despesas com garantias e imposição de Ônus (incluindo-se penhora de bens, ativos, direitos ou créditos, e/ou restrição parcial ou total, temporária ou definitiva, ao livre uso ou disposição de quaisquer montantes depositados em contas bancárias), ainda que seus efeitos se materializem apenas no futuro e independentemente do conhecimento das Partes.</w:t>
-      </w:r>
-    </w:p>
-    <w:p>
-      <w:pPr>
-        <w:pStyle w:val="Ttulo1"/>
-        <w:ind w:left="0"/>
-        <w:jc w:val="both"/>
+        <w:t xml:space="preserve"> em decorrência do evento e da empresa parceira, qualquer ação judicial intentada, mesmo que pendente de julgamento, todas as obrigações, responsabilidades, </w:t>
+      </w:r>
+      <w:r>
         <w:rPr>
           <w:b w:val="0"/>
           <w:bCs w:val="0"/>
@@ -6384,7 +6276,9 @@
           <w:szCs w:val="24"/>
           <w:lang w:val="pt-BR"/>
         </w:rPr>
-      </w:pPr>
+        <w:lastRenderedPageBreak/>
+        <w:t>contingências, perdas, danos diretos e indiretos, lucros cessantes, prejuízos, responsabilidade pecuniária ou conversível em pecúnia, custos e despesas com ações, processos, arbitragens ou procedimentos (incluindo valores pagos por avaliações, laudos, sentenças ou acordos, juros, multas, correção monetária, despesas de desembolso e honorários de advogados, contadores, peritos e outros especialistas, procedimentos,  honorários de sucumbência, custas judiciais, quaisquer outros custos e despesas direta ou indiretamente relacionados a uma Perda, bem como toda e qualquer multa, juros, indenização e/ou penalidade), depósitos judiciais e outros custos e despesas com garantias e imposição de Ônus (incluindo-se penhora de bens, ativos, direitos ou créditos, e/ou restrição parcial ou total, temporária ou definitiva, ao livre uso ou disposição de quaisquer montantes depositados em contas bancárias), ainda que seus efeitos se materializem apenas no futuro e independentemente do conhecimento das Partes.</w:t>
+      </w:r>
     </w:p>
     <w:p>
       <w:pPr>
@@ -6400,6 +6294,21 @@
           <w:lang w:val="pt-BR"/>
         </w:rPr>
       </w:pPr>
+    </w:p>
+    <w:p>
+      <w:pPr>
+        <w:pStyle w:val="Ttulo1"/>
+        <w:ind w:left="0"/>
+        <w:jc w:val="both"/>
+        <w:rPr>
+          <w:b w:val="0"/>
+          <w:bCs w:val="0"/>
+          <w:color w:val="000000" w:themeColor="text1"/>
+          <w:sz w:val="24"/>
+          <w:szCs w:val="24"/>
+          <w:lang w:val="pt-BR"/>
+        </w:rPr>
+      </w:pPr>
       <w:r>
         <w:rPr>
           <w:lang w:val="pt-BR"/>
@@ -6651,76 +6560,76 @@
         <w:rPr>
           <w:rFonts w:ascii="Arial" w:hAnsi="Arial" w:cs="Arial"/>
         </w:rPr>
+        <w:t>9.3. Para qualquer infração aos termos contratuais que não estipule penalidade própria, fica estabelecida multa</w:t>
+      </w:r>
+      <w:r>
+        <w:rPr>
+          <w:rFonts w:ascii="Arial" w:hAnsi="Arial" w:cs="Arial"/>
+        </w:rPr>
+        <w:t xml:space="preserve"> não compensatória</w:t>
+      </w:r>
+      <w:r>
+        <w:rPr>
+          <w:rFonts w:ascii="Arial" w:hAnsi="Arial" w:cs="Arial"/>
+        </w:rPr>
+        <w:t xml:space="preserve"> de </w:t>
+      </w:r>
+      <w:r>
+        <w:rPr>
+          <w:rFonts w:ascii="Arial" w:hAnsi="Arial" w:cs="Arial"/>
+        </w:rPr>
+        <w:t>{{</w:t>
+      </w:r>
+      <w:r>
+        <w:rPr>
+          <w:rFonts w:ascii="Arial" w:hAnsi="Arial" w:cs="Arial"/>
+        </w:rPr>
+        <w:t>PENALIDADEINFRACAOGERAL</w:t>
+      </w:r>
+      <w:r>
+        <w:rPr>
+          <w:rFonts w:ascii="Arial" w:hAnsi="Arial" w:cs="Arial"/>
+        </w:rPr>
+        <w:t>}}</w:t>
+      </w:r>
+      <w:r>
+        <w:rPr>
+          <w:rFonts w:ascii="Arial" w:hAnsi="Arial" w:cs="Arial"/>
+        </w:rPr>
+        <w:t>, sem excluir demais prejuízos.</w:t>
+      </w:r>
+    </w:p>
+    <w:p>
+      <w:pPr>
+        <w:spacing w:line="240" w:lineRule="auto"/>
+        <w:jc w:val="both"/>
+        <w:rPr>
+          <w:rFonts w:ascii="Arial" w:hAnsi="Arial" w:cs="Arial"/>
+          <w:b/>
+        </w:rPr>
+      </w:pPr>
+      <w:r>
+        <w:rPr>
+          <w:rFonts w:ascii="Arial" w:hAnsi="Arial" w:cs="Arial"/>
+          <w:b/>
+        </w:rPr>
+        <w:t>CLÁUSULA 10ª CONFIDENCIALIDADE</w:t>
+      </w:r>
+    </w:p>
+    <w:p>
+      <w:pPr>
+        <w:spacing w:line="240" w:lineRule="auto"/>
+        <w:jc w:val="both"/>
+        <w:rPr>
+          <w:rFonts w:ascii="Arial" w:hAnsi="Arial" w:cs="Arial"/>
+          <w:lang w:val="pt-PT"/>
+        </w:rPr>
+      </w:pPr>
+      <w:r>
+        <w:rPr>
+          <w:rFonts w:ascii="Arial" w:hAnsi="Arial" w:cs="Arial"/>
+        </w:rPr>
         <w:lastRenderedPageBreak/>
-        <w:t>9.3. Para qualquer infração aos termos contratuais que não estipule penalidade própria, fica estabelecida multa</w:t>
-      </w:r>
-      <w:r>
-        <w:rPr>
-          <w:rFonts w:ascii="Arial" w:hAnsi="Arial" w:cs="Arial"/>
-        </w:rPr>
-        <w:t xml:space="preserve"> não compensatória</w:t>
-      </w:r>
-      <w:r>
-        <w:rPr>
-          <w:rFonts w:ascii="Arial" w:hAnsi="Arial" w:cs="Arial"/>
-        </w:rPr>
-        <w:t xml:space="preserve"> de </w:t>
-      </w:r>
-      <w:r>
-        <w:rPr>
-          <w:rFonts w:ascii="Arial" w:hAnsi="Arial" w:cs="Arial"/>
-        </w:rPr>
-        <w:t>{{</w:t>
-      </w:r>
-      <w:r>
-        <w:rPr>
-          <w:rFonts w:ascii="Arial" w:hAnsi="Arial" w:cs="Arial"/>
-        </w:rPr>
-        <w:t>PENALIDADEINFRACAOGERAL</w:t>
-      </w:r>
-      <w:r>
-        <w:rPr>
-          <w:rFonts w:ascii="Arial" w:hAnsi="Arial" w:cs="Arial"/>
-        </w:rPr>
-        <w:t>}}</w:t>
-      </w:r>
-      <w:r>
-        <w:rPr>
-          <w:rFonts w:ascii="Arial" w:hAnsi="Arial" w:cs="Arial"/>
-        </w:rPr>
-        <w:t>, sem excluir demais prejuízos.</w:t>
-      </w:r>
-    </w:p>
-    <w:p>
-      <w:pPr>
-        <w:spacing w:line="240" w:lineRule="auto"/>
-        <w:jc w:val="both"/>
-        <w:rPr>
-          <w:rFonts w:ascii="Arial" w:hAnsi="Arial" w:cs="Arial"/>
-          <w:b/>
-        </w:rPr>
-      </w:pPr>
-      <w:r>
-        <w:rPr>
-          <w:rFonts w:ascii="Arial" w:hAnsi="Arial" w:cs="Arial"/>
-          <w:b/>
-        </w:rPr>
-        <w:t>CLÁUSULA 10ª CONFIDENCIALIDADE</w:t>
-      </w:r>
-    </w:p>
-    <w:p>
-      <w:pPr>
-        <w:spacing w:line="240" w:lineRule="auto"/>
-        <w:jc w:val="both"/>
-        <w:rPr>
-          <w:rFonts w:ascii="Arial" w:hAnsi="Arial" w:cs="Arial"/>
-          <w:lang w:val="pt-PT"/>
-        </w:rPr>
-      </w:pPr>
-      <w:r>
-        <w:rPr>
-          <w:rFonts w:ascii="Arial" w:hAnsi="Arial" w:cs="Arial"/>
-        </w:rPr>
         <w:t>10.1.</w:t>
       </w:r>
       <w:r>
@@ -7087,38 +6996,38 @@
         <w:rPr>
           <w:rFonts w:ascii="Arial" w:hAnsi="Arial" w:cs="Arial"/>
         </w:rPr>
+        <w:t>10.4.</w:t>
+      </w:r>
+      <w:r>
+        <w:rPr>
+          <w:rFonts w:ascii="Arial" w:hAnsi="Arial" w:cs="Arial"/>
+          <w:b/>
+        </w:rPr>
+        <w:t xml:space="preserve"> </w:t>
+      </w:r>
+      <w:r>
+        <w:rPr>
+          <w:rFonts w:ascii="Arial" w:hAnsi="Arial" w:cs="Arial"/>
+          <w:lang w:val="pt-PT"/>
+        </w:rPr>
+        <w:t>Não obstante ao compromisso de confidencialidade disposto nesta Cláusula, as Informações Confidenciais poderão ser divulgadas a terceiros com anuência por escrito das Partes.</w:t>
+      </w:r>
+    </w:p>
+    <w:p>
+      <w:pPr>
+        <w:spacing w:line="240" w:lineRule="auto"/>
+        <w:jc w:val="both"/>
+        <w:rPr>
+          <w:rFonts w:ascii="Arial" w:hAnsi="Arial" w:cs="Arial"/>
+          <w:lang w:val="pt-PT"/>
+        </w:rPr>
+      </w:pPr>
+      <w:r>
+        <w:rPr>
+          <w:rFonts w:ascii="Arial" w:hAnsi="Arial" w:cs="Arial"/>
+          <w:lang w:val="pt-PT"/>
+        </w:rPr>
         <w:lastRenderedPageBreak/>
-        <w:t>10.4.</w:t>
-      </w:r>
-      <w:r>
-        <w:rPr>
-          <w:rFonts w:ascii="Arial" w:hAnsi="Arial" w:cs="Arial"/>
-          <w:b/>
-        </w:rPr>
-        <w:t xml:space="preserve"> </w:t>
-      </w:r>
-      <w:r>
-        <w:rPr>
-          <w:rFonts w:ascii="Arial" w:hAnsi="Arial" w:cs="Arial"/>
-          <w:lang w:val="pt-PT"/>
-        </w:rPr>
-        <w:t>Não obstante ao compromisso de confidencialidade disposto nesta Cláusula, as Informações Confidenciais poderão ser divulgadas a terceiros com anuência por escrito das Partes.</w:t>
-      </w:r>
-    </w:p>
-    <w:p>
-      <w:pPr>
-        <w:spacing w:line="240" w:lineRule="auto"/>
-        <w:jc w:val="both"/>
-        <w:rPr>
-          <w:rFonts w:ascii="Arial" w:hAnsi="Arial" w:cs="Arial"/>
-          <w:lang w:val="pt-PT"/>
-        </w:rPr>
-      </w:pPr>
-      <w:r>
-        <w:rPr>
-          <w:rFonts w:ascii="Arial" w:hAnsi="Arial" w:cs="Arial"/>
-          <w:lang w:val="pt-PT"/>
-        </w:rPr>
         <w:t>10.5.</w:t>
       </w:r>
       <w:r>
@@ -9470,30 +9379,6 @@
 </file>
 
 <file path=customXml/item1.xml><?xml version="1.0" encoding="utf-8"?>
-<p:properties xmlns:p="http://schemas.microsoft.com/office/2006/metadata/properties" xmlns:xsi="http://www.w3.org/2001/XMLSchema-instance" xmlns:pc="http://schemas.microsoft.com/office/infopath/2007/PartnerControls">
-  <documentManagement>
-    <lcf76f155ced4ddcb4097134ff3c332f xmlns="b0abdc7c-b81f-47c0-8d37-e53421c16be1">
-      <Terms xmlns="http://schemas.microsoft.com/office/infopath/2007/PartnerControls"/>
-    </lcf76f155ced4ddcb4097134ff3c332f>
-    <TaxCatchAll xmlns="9b67fadb-89b0-45c3-8622-359d5aab3ac5" xsi:nil="true"/>
-  </documentManagement>
-</p:properties>
-</file>
-
-<file path=customXml/item2.xml><?xml version="1.0" encoding="utf-8"?>
-<?mso-contentType ?>
-<FormTemplates xmlns="http://schemas.microsoft.com/sharepoint/v3/contenttype/forms">
-  <Display>DocumentLibraryForm</Display>
-  <Edit>DocumentLibraryForm</Edit>
-  <New>DocumentLibraryForm</New>
-</FormTemplates>
-</file>
-
-<file path=customXml/item3.xml><?xml version="1.0" encoding="utf-8"?>
-<b:Sources xmlns:b="http://schemas.openxmlformats.org/officeDocument/2006/bibliography" xmlns="http://schemas.openxmlformats.org/officeDocument/2006/bibliography" SelectedStyle="\APA.XSL" StyleName="APA"/>
-</file>
-
-<file path=customXml/item4.xml><?xml version="1.0" encoding="utf-8"?>
 <ct:contentTypeSchema xmlns:ct="http://schemas.microsoft.com/office/2006/metadata/contentType" xmlns:ma="http://schemas.microsoft.com/office/2006/metadata/properties/metaAttributes" ct:_="" ma:_="" ma:contentTypeName="Documento" ma:contentTypeID="0x0101002F459F8D9828F745BE3B954ADB74309D" ma:contentTypeVersion="21" ma:contentTypeDescription="Crie um novo documento." ma:contentTypeScope="" ma:versionID="55daba8387c0a35d8e229400967f3b37">
   <xsd:schema xmlns:xsd="http://www.w3.org/2001/XMLSchema" xmlns:xs="http://www.w3.org/2001/XMLSchema" xmlns:p="http://schemas.microsoft.com/office/2006/metadata/properties" xmlns:ns2="b0abdc7c-b81f-47c0-8d37-e53421c16be1" xmlns:ns3="9b67fadb-89b0-45c3-8622-359d5aab3ac5" targetNamespace="http://schemas.microsoft.com/office/2006/metadata/properties" ma:root="true" ma:fieldsID="eb0d4114bff1126495d943ab6a7be351" ns2:_="" ns3:_="">
     <xsd:import namespace="b0abdc7c-b81f-47c0-8d37-e53421c16be1"/>
@@ -9754,34 +9639,31 @@
 </ct:contentTypeSchema>
 </file>
 
-<file path=customXml/itemProps1.xml><?xml version="1.0" encoding="utf-8"?>
-<ds:datastoreItem xmlns:ds="http://schemas.openxmlformats.org/officeDocument/2006/customXml" ds:itemID="{9D374E39-0C21-4940-9679-7C1E21D9F5E5}">
-  <ds:schemaRefs>
-    <ds:schemaRef ds:uri="http://schemas.microsoft.com/office/2006/metadata/properties"/>
-    <ds:schemaRef ds:uri="http://schemas.microsoft.com/office/infopath/2007/PartnerControls"/>
-    <ds:schemaRef ds:uri="b0abdc7c-b81f-47c0-8d37-e53421c16be1"/>
-    <ds:schemaRef ds:uri="9b67fadb-89b0-45c3-8622-359d5aab3ac5"/>
-  </ds:schemaRefs>
-</ds:datastoreItem>
+<file path=customXml/item2.xml><?xml version="1.0" encoding="utf-8"?>
+<b:Sources xmlns:b="http://schemas.openxmlformats.org/officeDocument/2006/bibliography" xmlns="http://schemas.openxmlformats.org/officeDocument/2006/bibliography" SelectedStyle="\APA.XSL" StyleName="APA"/>
 </file>
 
-<file path=customXml/itemProps2.xml><?xml version="1.0" encoding="utf-8"?>
-<ds:datastoreItem xmlns:ds="http://schemas.openxmlformats.org/officeDocument/2006/customXml" ds:itemID="{A8FDF9CD-DFE0-42B0-AA86-9CEEF4645DEB}">
-  <ds:schemaRefs>
-    <ds:schemaRef ds:uri="http://schemas.microsoft.com/sharepoint/v3/contenttype/forms"/>
-  </ds:schemaRefs>
-</ds:datastoreItem>
+<file path=customXml/item3.xml><?xml version="1.0" encoding="utf-8"?>
+<?mso-contentType ?>
+<FormTemplates xmlns="http://schemas.microsoft.com/sharepoint/v3/contenttype/forms">
+  <Display>DocumentLibraryForm</Display>
+  <Edit>DocumentLibraryForm</Edit>
+  <New>DocumentLibraryForm</New>
+</FormTemplates>
 </file>
 
-<file path=customXml/itemProps3.xml><?xml version="1.0" encoding="utf-8"?>
-<ds:datastoreItem xmlns:ds="http://schemas.openxmlformats.org/officeDocument/2006/customXml" ds:itemID="{7FB1261D-80BE-4784-8631-7621A184C5A6}">
-  <ds:schemaRefs>
-    <ds:schemaRef ds:uri="http://schemas.openxmlformats.org/officeDocument/2006/bibliography"/>
-  </ds:schemaRefs>
-</ds:datastoreItem>
+<file path=customXml/item4.xml><?xml version="1.0" encoding="utf-8"?>
+<p:properties xmlns:p="http://schemas.microsoft.com/office/2006/metadata/properties" xmlns:xsi="http://www.w3.org/2001/XMLSchema-instance" xmlns:pc="http://schemas.microsoft.com/office/infopath/2007/PartnerControls">
+  <documentManagement>
+    <lcf76f155ced4ddcb4097134ff3c332f xmlns="b0abdc7c-b81f-47c0-8d37-e53421c16be1">
+      <Terms xmlns="http://schemas.microsoft.com/office/infopath/2007/PartnerControls"/>
+    </lcf76f155ced4ddcb4097134ff3c332f>
+    <TaxCatchAll xmlns="9b67fadb-89b0-45c3-8622-359d5aab3ac5" xsi:nil="true"/>
+  </documentManagement>
+</p:properties>
 </file>
 
-<file path=customXml/itemProps4.xml><?xml version="1.0" encoding="utf-8"?>
+<file path=customXml/itemProps1.xml><?xml version="1.0" encoding="utf-8"?>
 <ds:datastoreItem xmlns:ds="http://schemas.openxmlformats.org/officeDocument/2006/customXml" ds:itemID="{BDF49FED-13BF-4798-B66E-9D4BDE11D6C6}">
   <ds:schemaRefs>
     <ds:schemaRef ds:uri="http://schemas.microsoft.com/office/2006/metadata/contentType"/>
@@ -9798,4 +9680,31 @@
     <ds:schemaRef ds:uri="http://schemas.microsoft.com/internal/obd"/>
   </ds:schemaRefs>
 </ds:datastoreItem>
+</file>
+
+<file path=customXml/itemProps2.xml><?xml version="1.0" encoding="utf-8"?>
+<ds:datastoreItem xmlns:ds="http://schemas.openxmlformats.org/officeDocument/2006/customXml" ds:itemID="{7FB1261D-80BE-4784-8631-7621A184C5A6}">
+  <ds:schemaRefs>
+    <ds:schemaRef ds:uri="http://schemas.openxmlformats.org/officeDocument/2006/bibliography"/>
+  </ds:schemaRefs>
+</ds:datastoreItem>
+</file>
+
+<file path=customXml/itemProps3.xml><?xml version="1.0" encoding="utf-8"?>
+<ds:datastoreItem xmlns:ds="http://schemas.openxmlformats.org/officeDocument/2006/customXml" ds:itemID="{A8FDF9CD-DFE0-42B0-AA86-9CEEF4645DEB}">
+  <ds:schemaRefs>
+    <ds:schemaRef ds:uri="http://schemas.microsoft.com/sharepoint/v3/contenttype/forms"/>
+  </ds:schemaRefs>
+</ds:datastoreItem>
+</file>
+
+<file path=customXml/itemProps4.xml><?xml version="1.0" encoding="utf-8"?>
+<ds:datastoreItem xmlns:ds="http://schemas.openxmlformats.org/officeDocument/2006/customXml" ds:itemID="{9D374E39-0C21-4940-9679-7C1E21D9F5E5}">
+  <ds:schemaRefs>
+    <ds:schemaRef ds:uri="http://schemas.microsoft.com/office/2006/metadata/properties"/>
+    <ds:schemaRef ds:uri="http://schemas.microsoft.com/office/infopath/2007/PartnerControls"/>
+    <ds:schemaRef ds:uri="b0abdc7c-b81f-47c0-8d37-e53421c16be1"/>
+    <ds:schemaRef ds:uri="9b67fadb-89b0-45c3-8622-359d5aab3ac5"/>
+  </ds:schemaRefs>
+</ds:datastoreItem>
 </file>
</xml_diff>